<commit_message>
Detail the mechanical scope stewarded on the 120->240 MMSCFD expansion
Replaces the generic 'reviewing machinery selection and integration' framing
with the actual scope: HP 1st-stage wet seal change-out, compressor
reconfiguration for export through the 1st stage, decommissioning of the
2nd-stage compressor and associated loops, and gas generator change-out with
associated off-skid activities. This is a shared bullet, so it updates both
CV targets.

Nudged the default PDF font baseline from 9.25pt to 9.0pt (a ~3% reduction
that scales the whole type system, not just body text) to absorb the added
length. The 11pt/12pt readability copies are unaffected, since they scale
from a fixed 9.25pt design reference regardless of what the default renders
at. All standard-size CVs hold three pages in PDF and Word.

Co-Authored-By: Claude Sonnet 5 <noreply@anthropic.com>
Claude-Session: https://claude.ai/code/session_013H3AMzMWzEerJx7AeqeVQp
</commit_message>
<xml_diff>
--- a/AZODO_EMEKA_CV_Machinery_Engineer_ExxonMobil.docx
+++ b/AZODO_EMEKA_CV_Machinery_Engineer_ExxonMobil.docx
@@ -1388,7 +1388,7 @@
           <w:color w:val="1A1A1A"/>
           <w:sz w:val="17"/>
         </w:rPr>
-        <w:t xml:space="preserve">Provide discipline support to the </w:t>
+        <w:t xml:space="preserve">Steward </w:t>
       </w:r>
       <w:r>
         <w:rPr>
@@ -1398,7 +1398,7 @@
           <w:color w:val="1A1A1A"/>
           <w:sz w:val="17"/>
         </w:rPr>
-        <w:t>120 → 240 MMSCFD expansion</w:t>
+        <w:t>safe and timely execution of the mechanical scope</w:t>
       </w:r>
       <w:r>
         <w:rPr>
@@ -1408,7 +1408,7 @@
           <w:color w:val="1A1A1A"/>
           <w:sz w:val="17"/>
         </w:rPr>
-        <w:t>, reviewing machinery selection and integration of new equipment into the existing gas processing and NGL trains.</w:t>
+        <w:t xml:space="preserve"> for the 120 → 240 MMSCFD expansion: HP 1st-stage wet seal change-out, compressor reconfiguration for export through the 1st stage, decommissioning of the 2nd-stage compressor and associated loops, and gas generator change-out with associated off-skid activities.</w:t>
       </w:r>
     </w:p>
     <w:p>

</xml_diff>

<commit_message>
Restore IE Safetainability QHSE certification to CV
Re-add "QHSE, Risk & Sustainability Mgmt, IE Safetainability, 2024" to
the Certifications & Professional Development grid; it was mistakenly
cut in an earlier space-saving pass. All variants still hold at their
target page counts (3 pages standard, 5 pages for the 11pt/12pt Exxon
readability copies).

Co-Authored-By: Claude Sonnet 5 <noreply@anthropic.com>
Claude-Session: https://claude.ai/code/session_013H3AMzMWzEerJx7AeqeVQp
</commit_message>
<xml_diff>
--- a/AZODO_EMEKA_CV_Machinery_Engineer_ExxonMobil.docx
+++ b/AZODO_EMEKA_CV_Machinery_Engineer_ExxonMobil.docx
@@ -2962,7 +2962,7 @@
                 <w:color w:val="1A1A1A"/>
                 <w:sz w:val="16"/>
               </w:rPr>
-              <w:t>• AI Advanced Applied Programme, Digital Regenesys, 2026</w:t>
+              <w:t>• QHSE, Risk &amp; Sustainability Mgmt, IE Safetainability, 2024</w:t>
             </w:r>
           </w:p>
         </w:tc>
@@ -2982,8 +2982,50 @@
                 <w:color w:val="1A1A1A"/>
                 <w:sz w:val="16"/>
               </w:rPr>
+              <w:t>• AI Advanced Applied Programme, Digital Regenesys, 2026</w:t>
+            </w:r>
+          </w:p>
+        </w:tc>
+      </w:tr>
+      <w:tr>
+        <w:tc>
+          <w:tcPr>
+            <w:tcW w:type="dxa" w:w="3288"/>
+          </w:tcPr>
+          <w:p>
+            <w:pPr>
+              <w:spacing w:before="0" w:after="20" w:line="240" w:lineRule="auto"/>
+            </w:pPr>
+            <w:r>
+              <w:rPr>
+                <w:rFonts w:ascii="Calibri" w:hAnsi="Calibri"/>
+                <w:b w:val="0"/>
+                <w:i w:val="0"/>
+                <w:color w:val="1A1A1A"/>
+                <w:sz w:val="16"/>
+              </w:rPr>
               <w:t>• IBM AI Engineering, 2023 &amp; Generative AI and Agents, Johns Hopkins, 2026</w:t>
             </w:r>
+          </w:p>
+        </w:tc>
+        <w:tc>
+          <w:tcPr>
+            <w:tcW w:type="dxa" w:w="3288"/>
+          </w:tcPr>
+          <w:p>
+            <w:pPr>
+              <w:spacing w:before="0" w:after="20" w:line="240" w:lineRule="auto"/>
+            </w:pPr>
+          </w:p>
+        </w:tc>
+        <w:tc>
+          <w:tcPr>
+            <w:tcW w:type="dxa" w:w="3288"/>
+          </w:tcPr>
+          <w:p>
+            <w:pPr>
+              <w:spacing w:before="0" w:after="20" w:line="240" w:lineRule="auto"/>
+            </w:pPr>
           </w:p>
         </w:tc>
       </w:tr>

</xml_diff>

<commit_message>
Add safety hazard identification track record, correctly attributed
Add a bullet under the current Oso/Seplat role for consistent hazard
identification and follow-up under Seplat's Hazard Identification &
Control Scheme (SHICS), using digital reporting tools, as clarified by
the candidate. Keep the Safety Sentinel and Safety Advocate of the Year
awards (2023) under FIPL, where they were actually won, rather than
conflating them with the Seplat-specific SHICS programme. Reflect the
same safety strength in both cover letters. All CVs verified to hold
their target page counts; both cover letters remain at 1 page.

Co-Authored-By: Claude Sonnet 5 <noreply@anthropic.com>
Claude-Session: https://claude.ai/code/session_013H3AMzMWzEerJx7AeqeVQp
</commit_message>
<xml_diff>
--- a/AZODO_EMEKA_CV_Machinery_Engineer_ExxonMobil.docx
+++ b/AZODO_EMEKA_CV_Machinery_Engineer_ExxonMobil.docx
@@ -1413,6 +1413,44 @@
     </w:p>
     <w:p>
       <w:pPr>
+        <w:pStyle w:val="ListBullet"/>
+        <w:spacing w:before="0" w:after="24" w:line="240" w:lineRule="auto"/>
+        <w:ind w:left="283"/>
+        <w:jc w:val="both"/>
+      </w:pPr>
+      <w:r>
+        <w:rPr>
+          <w:rFonts w:ascii="Calibri" w:hAnsi="Calibri"/>
+          <w:b w:val="0"/>
+          <w:i w:val="0"/>
+          <w:color w:val="1A1A1A"/>
+          <w:sz w:val="17"/>
+        </w:rPr>
+        <w:t xml:space="preserve">Maintain an appreciable record of identifying and following up on safety hazards under Seplat's </w:t>
+      </w:r>
+      <w:r>
+        <w:rPr>
+          <w:rFonts w:ascii="Calibri" w:hAnsi="Calibri"/>
+          <w:b/>
+          <w:i w:val="0"/>
+          <w:color w:val="1A1A1A"/>
+          <w:sz w:val="17"/>
+        </w:rPr>
+        <w:t>Hazard Identification &amp; Control Scheme (SHICS)</w:t>
+      </w:r>
+      <w:r>
+        <w:rPr>
+          <w:rFonts w:ascii="Calibri" w:hAnsi="Calibri"/>
+          <w:b w:val="0"/>
+          <w:i w:val="0"/>
+          <w:color w:val="1A1A1A"/>
+          <w:sz w:val="17"/>
+        </w:rPr>
+        <w:t>, using the relevant digital reporting tools, with consistent commendation on several occasions.</w:t>
+      </w:r>
+    </w:p>
+    <w:p>
+      <w:pPr>
         <w:spacing w:before="0" w:after="0" w:line="40" w:lineRule="exact"/>
       </w:pPr>
     </w:p>
@@ -1726,6 +1764,64 @@
           <w:sz w:val="17"/>
         </w:rPr>
         <w:t xml:space="preserve"> per event through procedure and scope optimisation.</w:t>
+      </w:r>
+    </w:p>
+    <w:p>
+      <w:pPr>
+        <w:pStyle w:val="ListBullet"/>
+        <w:spacing w:before="0" w:after="24" w:line="240" w:lineRule="auto"/>
+        <w:ind w:left="283"/>
+        <w:jc w:val="both"/>
+      </w:pPr>
+      <w:r>
+        <w:rPr>
+          <w:rFonts w:ascii="Calibri" w:hAnsi="Calibri"/>
+          <w:b w:val="0"/>
+          <w:i w:val="0"/>
+          <w:color w:val="1A1A1A"/>
+          <w:sz w:val="17"/>
+        </w:rPr>
+        <w:t xml:space="preserve">Recognised for safety leadership: </w:t>
+      </w:r>
+      <w:r>
+        <w:rPr>
+          <w:rFonts w:ascii="Calibri" w:hAnsi="Calibri"/>
+          <w:b/>
+          <w:i w:val="0"/>
+          <w:color w:val="1A1A1A"/>
+          <w:sz w:val="17"/>
+        </w:rPr>
+        <w:t>Safety Sentinel</w:t>
+      </w:r>
+      <w:r>
+        <w:rPr>
+          <w:rFonts w:ascii="Calibri" w:hAnsi="Calibri"/>
+          <w:b w:val="0"/>
+          <w:i w:val="0"/>
+          <w:color w:val="1A1A1A"/>
+          <w:sz w:val="17"/>
+        </w:rPr>
+        <w:t xml:space="preserve"> and </w:t>
+      </w:r>
+      <w:r>
+        <w:rPr>
+          <w:rFonts w:ascii="Calibri" w:hAnsi="Calibri"/>
+          <w:b/>
+          <w:i w:val="0"/>
+          <w:color w:val="1A1A1A"/>
+          <w:sz w:val="17"/>
+        </w:rPr>
+        <w:t>Safety Advocate of the Year</w:t>
+      </w:r>
+      <w:r>
+        <w:rPr>
+          <w:rFonts w:ascii="Calibri" w:hAnsi="Calibri"/>
+          <w:b w:val="0"/>
+          <w:i w:val="0"/>
+          <w:color w:val="1A1A1A"/>
+          <w:sz w:val="17"/>
+        </w:rPr>
+        <w:t xml:space="preserve"> awards (2023) for consistent hazard identification and follow-up.</w:t>
       </w:r>
     </w:p>
     <w:p>

</xml_diff>

<commit_message>
Frame Oso as the key enabler of Seplat's 240 MMSCFD sales gas ambition
Elevate the shared current-role description in cv_content.py from "Oso
Gas Hub (120 MMSCFD..., expanding to 240 MMSCFD)" to "Oso Gas Hub, the
key enabler of Seplat's 120 -> 240 MMSCFD sales gas ambition", applying
across all three CV targets (Qatar, ExxonMobil, Seplat). Added the same
framing to the Seplat cover letter's opening paragraph. All documents
verified to hold their target page counts in both PDF and Word.

Co-Authored-By: Claude Sonnet 5 <noreply@anthropic.com>
Claude-Session: https://claude.ai/code/session_013H3AMzMWzEerJx7AeqeVQp
</commit_message>
<xml_diff>
--- a/AZODO_EMEKA_CV_Machinery_Engineer_ExxonMobil.docx
+++ b/AZODO_EMEKA_CV_Machinery_Engineer_ExxonMobil.docx
@@ -739,7 +739,27 @@
           <w:color w:val="1A1A1A"/>
           <w:sz w:val="17"/>
         </w:rPr>
-        <w:t xml:space="preserve"> (120 MMSCFD sales gas + NGL export, expanding to 240 MMSCFD), covering top-tier machinery (HP/LP compressors, recompressors, turbo-expanders, cryogenic pumps), utilities (gas turbine generators, firewater pumps, air compressors) and the NGL fractionation train (de-ethaniser, de-propaniser, de-butaniser).</w:t>
+        <w:t xml:space="preserve">, the </w:t>
+      </w:r>
+      <w:r>
+        <w:rPr>
+          <w:rFonts w:ascii="Calibri" w:hAnsi="Calibri"/>
+          <w:b/>
+          <w:i w:val="0"/>
+          <w:color w:val="1A1A1A"/>
+          <w:sz w:val="17"/>
+        </w:rPr>
+        <w:t>key enabler of Seplat's 120 → 240 MMSCFD sales gas ambition</w:t>
+      </w:r>
+      <w:r>
+        <w:rPr>
+          <w:rFonts w:ascii="Calibri" w:hAnsi="Calibri"/>
+          <w:b w:val="0"/>
+          <w:i w:val="0"/>
+          <w:color w:val="1A1A1A"/>
+          <w:sz w:val="17"/>
+        </w:rPr>
+        <w:t xml:space="preserve"> and NGL export, covering top-tier machinery (HP/LP compressors, recompressors, turbo-expanders, cryogenic pumps), utilities (gas turbine generators, firewater pumps, air compressors) and the NGL fractionation train (de-ethaniser, de-propaniser, de-butaniser).</w:t>
       </w:r>
     </w:p>
     <w:p>

</xml_diff>